<commit_message>
배포본 EXE\WCS_CLIENT 에 메인 화면 그리기 개선판 반영 (Release 09-14 16:34)
- Ecs.exe / DciLib.dll 교체 (EcsLib.dll·XmlLib.dll 은 바이트 동일)
  들어간 것 : 화면 직접 그리기 제거, 수집 스레드 다시 그리기의 배경 지우기 끔,
             글자 칸 맞춤 캐시, [PAINT]/[COLLECT]/[TRK] 계측 로그(UI_TRACE=1)
- 같은 시간대 번갈아 측정 (개발 PC, 시뮬 체인 운전 중, 각 약 2.5분)
    캐시만 뺀 판 : 그리기 1회 평균 41.5 ms (350회)
    세 가지 적용 : 그리기 1회 평균 26.4 ms (355회)
  → 앞 커밋의 "적용 후 39 ms" 는 측정 시점 부하 차이였고 캐시는 느려짐의 원인이 아니다.
- 이전 배포본은 스크래치패드 EXE_backup_20260914 에 보관
- 9/15 점검표 Client 배포 시각 갱신

Co-Authored-By: Claude Opus 5 <noreply@anthropic.com>
</commit_message>
<xml_diff>
--- a/docs/현장점검_20260915.docx
+++ b/docs/현장점검_20260915.docx
@@ -145,7 +145,7 @@
                 <w:sz w:val="19"/>
                 <w:szCs w:val="19"/>
               </w:rPr>
-              <w:t xml:space="preserve"> 09-12 17:18 (+ </w:t>
+              <w:t xml:space="preserve"> 09-14 16:34 (+ </w:t>
             </w:r>
             <w:r>
               <w:rPr>
@@ -5811,7 +5811,7 @@
           <w:sz w:val="16"/>
           <w:szCs w:val="16"/>
         </w:rPr>
-        <w:t xml:space="preserve">2026-09-12 작성 · 09-13 1호기 근거·조사본 오기 보완 · 09-14 단일 비트 쓰기 반영 · 원본 docs\현장점검_20260915.md</w:t>
+        <w:t xml:space="preserve">2026-09-12 작성 · 09-13 1호기 근거·조사본 오기 보완 · 09-14 단일 비트 쓰기 반영 · 09-14 화면 그리기 개선 Client 반영 · 원본 docs\현장점검_20260915.md</w:t>
       </w:r>
     </w:p>
     <w:sectPr>

</xml_diff>

<commit_message>
C/V 방향 워드 부호(입고/출고 0·1)를 EQP_TASK 라디오로 고른다 - WCS_DB.INI [PLC] DIR_CODE=IN0|IN1 (사용자 지시)
현장 PLC 담당자가 래더에서 확인한 값은 입고=1/출고=0, 우리 기준은 입고=0/출고=1 이었다.
- cDefApp.GM_DIR_IN1 / GsDirChar(bOut) : IN0(현행) 입고 '0'·출고 '1', IN1 은 반대
- CvThread : 방향지시 쓰기(CvChg_CMD_RQ_YN)와 방향워드 판독(CvStatusScenario -> STOCK_MODE) 양쪽에 적용,
  로그에 실제 문자와 [IN1] 표기 (예 "출고('0') → D워드 310 [IN1]")
- SYS_MAIN : pnlTop 을 한 줄 늘려 셋째 줄에 라디오 [C/V 방향 부호 : 입고=0/출고=1 (현행)] / [입고=1/출고=0 (PLC 담당자 확인값)]
  (첫 줄 오른쪽 배치는 글자 잘림·겹침 - 사용자 지적으로 이동). 전환 즉시 ini 저장, 다음 지시부터 적용.
- ini 2벌에 DIR_CODE=IN0 + 설명. 시뮬은 IN0 만 이해하므로 기본값 IN0.
검증 : IN1 전환 후 시뮬에서 "[103] 방향지시 입고('1')", "[122] 방향지시 출고('0') [IN1]" 기록 확인, IN0 복귀.
배포본 EXE\TASK\WCS_TASK_CV 갱신(15:36), 9/15 점검표 7번에 안내 추가.

Co-Authored-By: Claude Fable 5.1 <noreply@anthropic.com>
</commit_message>
<xml_diff>
--- a/docs/현장점검_20260915.docx
+++ b/docs/현장점검_20260915.docx
@@ -279,7 +279,7 @@
                 <w:sz w:val="19"/>
                 <w:szCs w:val="19"/>
               </w:rPr>
-              <w:t xml:space="preserve"> 09-14 06:05 · </w:t>
+              <w:t xml:space="preserve"> 09-15 15:36 · </w:t>
             </w:r>
             <w:r>
               <w:rPr>
@@ -298,7 +298,7 @@
                 <w:sz w:val="19"/>
                 <w:szCs w:val="19"/>
               </w:rPr>
-              <w:t xml:space="preserve"> 09-14 · </w:t>
+              <w:t xml:space="preserve"> 09-15 · </w:t>
             </w:r>
             <w:r>
               <w:rPr>
@@ -4692,6 +4692,131 @@
           <w:szCs w:val="19"/>
         </w:rPr>
         <w:t xml:space="preserve">(0x31)이 맞는가</w:t>
+      </w:r>
+    </w:p>
+    <w:p>
+      <w:pPr>
+        <w:pStyle w:val="ListParagraph"/>
+        <w:numPr>
+          <w:ilvl w:val="0"/>
+          <w:numId w:val="3"/>
+        </w:numPr>
+        <w:spacing w:after="20" w:before="20" w:line="276"/>
+      </w:pPr>
+      <w:r>
+        <w:rPr>
+          <w:rFonts w:ascii="Malgun Gothic" w:cs="Malgun Gothic" w:eastAsia="맑은 고딕" w:hAnsi="Malgun Gothic"/>
+          <w:b/>
+          <w:bCs/>
+          <w:color w:val="1A222C"/>
+          <w:sz w:val="19"/>
+          <w:szCs w:val="19"/>
+        </w:rPr>
+        <w:t xml:space="preserve">C/V 방향 워드 부호</w:t>
+      </w:r>
+      <w:r>
+        <w:rPr>
+          <w:rFonts w:ascii="Malgun Gothic" w:cs="Malgun Gothic" w:eastAsia="맑은 고딕" w:hAnsi="Malgun Gothic"/>
+          <w:color w:val="1A222C"/>
+          <w:sz w:val="19"/>
+          <w:szCs w:val="19"/>
+        </w:rPr>
+        <w:t xml:space="preserve"> - PLC 담당자 확인값은 입고=1/출고=0 이고 우리 기준은 입고=0/출고=1 이었다. 09-15 </w:t>
+      </w:r>
+      <w:r>
+        <w:rPr>
+          <w:rFonts w:ascii="Consolas" w:cs="Consolas" w:eastAsia="맑은 고딕" w:hAnsi="Consolas"/>
+          <w:color w:val="1A222C"/>
+          <w:sz w:val="17"/>
+          <w:szCs w:val="17"/>
+          <w:shd w:fill="EEF1F0" w:color="auto" w:val="clear"/>
+        </w:rPr>
+        <w:t xml:space="preserve">WCS_TASK_CV.exe</w:t>
+      </w:r>
+      <w:r>
+        <w:rPr>
+          <w:rFonts w:ascii="Malgun Gothic" w:cs="Malgun Gothic" w:eastAsia="맑은 고딕" w:hAnsi="Malgun Gothic"/>
+          <w:color w:val="1A222C"/>
+          <w:sz w:val="19"/>
+          <w:szCs w:val="19"/>
+        </w:rPr>
+        <w:t xml:space="preserve">(15:36) 첫 화면 셋째 줄 라디오 [C/V 방향 부호]로 바꿀 수 있다(</w:t>
+      </w:r>
+      <w:r>
+        <w:rPr>
+          <w:rFonts w:ascii="Consolas" w:cs="Consolas" w:eastAsia="맑은 고딕" w:hAnsi="Consolas"/>
+          <w:color w:val="1A222C"/>
+          <w:sz w:val="17"/>
+          <w:szCs w:val="17"/>
+          <w:shd w:fill="EEF1F0" w:color="auto" w:val="clear"/>
+        </w:rPr>
+        <w:t xml:space="preserve">WCS_DB.INI</w:t>
+      </w:r>
+      <w:r>
+        <w:rPr>
+          <w:rFonts w:ascii="Malgun Gothic" w:cs="Malgun Gothic" w:eastAsia="맑은 고딕" w:hAnsi="Malgun Gothic"/>
+          <w:color w:val="1A222C"/>
+          <w:sz w:val="19"/>
+          <w:szCs w:val="19"/>
+        </w:rPr>
+        <w:t xml:space="preserve"> [PLC] </w:t>
+      </w:r>
+      <w:r>
+        <w:rPr>
+          <w:rFonts w:ascii="Consolas" w:cs="Consolas" w:eastAsia="맑은 고딕" w:hAnsi="Consolas"/>
+          <w:color w:val="1A222C"/>
+          <w:sz w:val="17"/>
+          <w:szCs w:val="17"/>
+          <w:shd w:fill="EEF1F0" w:color="auto" w:val="clear"/>
+        </w:rPr>
+        <w:t xml:space="preserve">DIR_CODE=IN0|IN1</w:t>
+      </w:r>
+      <w:r>
+        <w:rPr>
+          <w:rFonts w:ascii="Malgun Gothic" w:cs="Malgun Gothic" w:eastAsia="맑은 고딕" w:hAnsi="Malgun Gothic"/>
+          <w:color w:val="1A222C"/>
+          <w:sz w:val="19"/>
+          <w:szCs w:val="19"/>
+        </w:rPr>
+        <w:t xml:space="preserve">, 재기동 없이 다음 지시부터, 쓰기·판독 양쪽). 담당자와 확정한 뒤 IN1 로 바꾸고, 122·103 방향지시 로그에 </w:t>
+      </w:r>
+      <w:r>
+        <w:rPr>
+          <w:rFonts w:ascii="Consolas" w:cs="Consolas" w:eastAsia="맑은 고딕" w:hAnsi="Consolas"/>
+          <w:color w:val="1A222C"/>
+          <w:sz w:val="17"/>
+          <w:szCs w:val="17"/>
+          <w:shd w:fill="EEF1F0" w:color="auto" w:val="clear"/>
+        </w:rPr>
+        <w:t xml:space="preserve">입고(’1’)</w:t>
+      </w:r>
+      <w:r>
+        <w:rPr>
+          <w:rFonts w:ascii="Malgun Gothic" w:cs="Malgun Gothic" w:eastAsia="맑은 고딕" w:hAnsi="Malgun Gothic"/>
+          <w:color w:val="1A222C"/>
+          <w:sz w:val="19"/>
+          <w:szCs w:val="19"/>
+        </w:rPr>
+        <w:t xml:space="preserve">/</w:t>
+      </w:r>
+      <w:r>
+        <w:rPr>
+          <w:rFonts w:ascii="Consolas" w:cs="Consolas" w:eastAsia="맑은 고딕" w:hAnsi="Consolas"/>
+          <w:color w:val="1A222C"/>
+          <w:sz w:val="17"/>
+          <w:szCs w:val="17"/>
+          <w:shd w:fill="EEF1F0" w:color="auto" w:val="clear"/>
+        </w:rPr>
+        <w:t xml:space="preserve">출고(’0’) [IN1]</w:t>
+      </w:r>
+      <w:r>
+        <w:rPr>
+          <w:rFonts w:ascii="Malgun Gothic" w:cs="Malgun Gothic" w:eastAsia="맑은 고딕" w:hAnsi="Malgun Gothic"/>
+          <w:color w:val="1A222C"/>
+          <w:sz w:val="19"/>
+          <w:szCs w:val="19"/>
+        </w:rPr>
+        <w:t xml:space="preserve"> 로 찍히는지와 벨트 방향이 맞는지 본다.</w:t>
       </w:r>
     </w:p>
     <w:p>

</xml_diff>